<commit_message>
divided into two docs
</commit_message>
<xml_diff>
--- a/story.docx
+++ b/story.docx
@@ -643,276 +643,6 @@
         </w:rPr>
         <w:t>Уши мы назначили на четверг.</w:t>
       </w:r>
-    </w:p>
-    <w:p>
-      <w:r>
-        <w:pict w14:anchorId="2916D3C8">
-          <v:rect id="_x0000_i1031" style="width:0;height:1.5pt" o:hralign="center" o:hrstd="t" o:hr="t" fillcolor="#a0a0a0" stroked="f"/>
-        </w:pict>
-      </w:r>
-    </w:p>
-    <w:p>
-      <w:pPr>
-        <w:rPr>
-          <w:lang w:val="ru-RU"/>
-        </w:rPr>
-      </w:pPr>
-      <w:r>
-        <w:rPr>
-          <w:i/>
-          <w:iCs/>
-          <w:lang w:val="ru-RU"/>
-        </w:rPr>
-        <w:t>≈5 300 знаков с пробелами.</w:t>
-      </w:r>
-    </w:p>
-    <w:p/>
-    <w:p>
-      <w:pPr>
-        <w:rPr>
-          <w:lang w:val="ru-RU"/>
-        </w:rPr>
-      </w:pPr>
-      <w:r>
-        <w:rPr>
-          <w:lang w:val="ru-RU"/>
-        </w:rPr>
-        <w:lastRenderedPageBreak/>
-        <w:t>Какие здесь есть аллегори и т.д.?</w:t>
-      </w:r>
-    </w:p>
-    <w:p>
-      <w:pPr>
-        <w:rPr>
-          <w:lang w:val="ru-RU"/>
-        </w:rPr>
-      </w:pPr>
-      <w:r>
-        <w:rPr>
-          <w:lang w:val="ru-RU"/>
-        </w:rPr>
-        <w:t>Главная аллегория — свадебная формула, понятая буквально. Эпиграф «и прилепится к жене своей, и будут двое одна плоть» читают на каждом православном венчании. Князь в церкви улыбается, потому что понимает эти слова дословно. «Узы брака» становятся гипсовой повязкой, а плоть жены — его лицом.</w:t>
-      </w:r>
-    </w:p>
-    <w:p>
-      <w:pPr>
-        <w:numPr>
-          <w:ilvl w:val="0"/>
-          <w:numId w:val="1"/>
-        </w:numPr>
-        <w:rPr>
-          <w:lang w:val="ru-RU"/>
-        </w:rPr>
-      </w:pPr>
-      <w:r>
-        <w:rPr>
-          <w:b/>
-          <w:bCs/>
-          <w:lang w:val="ru-RU"/>
-        </w:rPr>
-        <w:t>«Безносая»</w:t>
-      </w:r>
-      <w:r>
-        <w:rPr>
-          <w:lang w:val="ru-RU"/>
-        </w:rPr>
-        <w:t xml:space="preserve"> — народное имя смерти. Князь и есть смерть для жены, только страшнее обычной: та, что не даёт умереть.</w:t>
-      </w:r>
-    </w:p>
-    <w:p>
-      <w:pPr>
-        <w:numPr>
-          <w:ilvl w:val="0"/>
-          <w:numId w:val="1"/>
-        </w:numPr>
-        <w:rPr>
-          <w:lang w:val="ru-RU"/>
-        </w:rPr>
-      </w:pPr>
-      <w:r>
-        <w:rPr>
-          <w:b/>
-          <w:bCs/>
-          <w:lang w:val="ru-RU"/>
-        </w:rPr>
-        <w:t>Надежда.</w:t>
-      </w:r>
-      <w:r>
-        <w:rPr>
-          <w:lang w:val="ru-RU"/>
-        </w:rPr>
-        <w:t xml:space="preserve"> Её буквально оставляют в склепе, как в дантовском «оставь надежду» у врат ада. Погребение заживо в фамильном склепе — поклон «Падению дома Ашеров» По.</w:t>
-      </w:r>
-    </w:p>
-    <w:p>
-      <w:pPr>
-        <w:numPr>
-          <w:ilvl w:val="0"/>
-          <w:numId w:val="1"/>
-        </w:numPr>
-        <w:rPr>
-          <w:lang w:val="ru-RU"/>
-        </w:rPr>
-      </w:pPr>
-      <w:r>
-        <w:rPr>
-          <w:b/>
-          <w:bCs/>
-          <w:lang w:val="ru-RU"/>
-        </w:rPr>
-        <w:t>Гоголь.</w:t>
-      </w:r>
-      <w:r>
-        <w:rPr>
-          <w:lang w:val="ru-RU"/>
-        </w:rPr>
-        <w:t xml:space="preserve"> Первая запись помечена 25 марта: этим числом открывается «Нос». К тому же это Благовещение, день благой вести. Князь говорит о носе «он», как о живом, и нос ему дороже жены.</w:t>
-      </w:r>
-    </w:p>
-    <w:p>
-      <w:pPr>
-        <w:numPr>
-          <w:ilvl w:val="0"/>
-          <w:numId w:val="1"/>
-        </w:numPr>
-        <w:rPr>
-          <w:lang w:val="ru-RU"/>
-        </w:rPr>
-      </w:pPr>
-      <w:r>
-        <w:rPr>
-          <w:b/>
-          <w:bCs/>
-          <w:lang w:val="ru-RU"/>
-        </w:rPr>
-        <w:t>Нос-младенец.</w:t>
-      </w:r>
-      <w:r>
-        <w:rPr>
-          <w:lang w:val="ru-RU"/>
-        </w:rPr>
-        <w:t xml:space="preserve"> У ван Гельмонта донор назван «родителем», и эта легенда подлинная. Наденька зовёт нос «почти ребёнком», а князь чмокает у раны, «как младенец у груди». Единственный плод этого брака — паразит, который кормится матерью. В финале уже мать кормят силой, чтобы жил «ребёнок».</w:t>
-      </w:r>
-    </w:p>
-    <w:p>
-      <w:pPr>
-        <w:numPr>
-          <w:ilvl w:val="0"/>
-          <w:numId w:val="1"/>
-        </w:numPr>
-        <w:rPr>
-          <w:lang w:val="ru-RU"/>
-        </w:rPr>
-      </w:pPr>
-      <w:r>
-        <w:rPr>
-          <w:b/>
-          <w:bCs/>
-          <w:lang w:val="ru-RU"/>
-        </w:rPr>
-        <w:t>Дездемона</w:t>
-      </w:r>
-      <w:r>
-        <w:rPr>
-          <w:lang w:val="ru-RU"/>
-        </w:rPr>
-        <w:t xml:space="preserve"> полюбила «за муки» и погибла от руки мужа. Вторая половина той строки, «а я её — за состраданье к ним», здесь вывернута: князь полюбил её кожу.</w:t>
-      </w:r>
-    </w:p>
-    <w:p>
-      <w:pPr>
-        <w:numPr>
-          <w:ilvl w:val="0"/>
-          <w:numId w:val="1"/>
-        </w:numPr>
-        <w:rPr>
-          <w:lang w:val="ru-RU"/>
-        </w:rPr>
-      </w:pPr>
-      <w:r>
-        <w:rPr>
-          <w:b/>
-          <w:bCs/>
-          <w:lang w:val="ru-RU"/>
-        </w:rPr>
-        <w:t>Доктор — главное чудовище.</w:t>
-      </w:r>
-      <w:r>
-        <w:rPr>
-          <w:lang w:val="ru-RU"/>
-        </w:rPr>
-        <w:t xml:space="preserve"> Фамилия Сыромятников идёт от сыромятной кожи, и кроит он «как перчаточник лайку». Он трижды выбирает себя: бром вместо помощи, статья вместо траура, зонд вместо городового.</w:t>
-      </w:r>
-    </w:p>
-    <w:p>
-      <w:pPr>
-        <w:numPr>
-          <w:ilvl w:val="0"/>
-          <w:numId w:val="1"/>
-        </w:numPr>
-        <w:rPr>
-          <w:lang w:val="ru-RU"/>
-        </w:rPr>
-      </w:pPr>
-      <w:r>
-        <w:rPr>
-          <w:b/>
-          <w:bCs/>
-          <w:lang w:val="ru-RU"/>
-        </w:rPr>
-        <w:t>Зло как канцелярия.</w:t>
-      </w:r>
-      <w:r>
-        <w:rPr>
-          <w:lang w:val="ru-RU"/>
-        </w:rPr>
-        <w:t xml:space="preserve"> Башибузуки режут уши «для отчёта», а финал — «уши мы назначили на четверг». Изувеченный сам стал палачом. В этом «мы» — союз титула и науки против беззащитной.</w:t>
-      </w:r>
-    </w:p>
-    <w:p>
-      <w:pPr>
-        <w:numPr>
-          <w:ilvl w:val="0"/>
-          <w:numId w:val="1"/>
-        </w:numPr>
-        <w:rPr>
-          <w:lang w:val="ru-RU"/>
-        </w:rPr>
-      </w:pPr>
-      <w:r>
-        <w:rPr>
-          <w:b/>
-          <w:bCs/>
-          <w:lang w:val="ru-RU"/>
-        </w:rPr>
-        <w:t>Белая ночь.</w:t>
-      </w:r>
-      <w:r>
-        <w:rPr>
-          <w:lang w:val="ru-RU"/>
-        </w:rPr>
-        <w:t xml:space="preserve"> Развязка приходится на ночь, когда тьмы нет вовсе. А она живёт в полной темноте и побелела, как росток в погребе.</w:t>
-      </w:r>
-    </w:p>
-    <w:p>
-      <w:pPr>
-        <w:rPr>
-          <w:lang w:val="ru-RU"/>
-        </w:rPr>
-      </w:pPr>
-      <w:r>
-        <w:rPr>
-          <w:lang w:val="ru-RU"/>
-        </w:rPr>
-        <w:t>Улики к развязке разложены честно, по-акунински: «по словам князя», пьяный немец со свидетельством, оспа, которой больше никто не заболел, лёгкий гроб, «она всегда при мне». Гроб несут двое, и в конце держат её тоже двое.</w:t>
-      </w:r>
-    </w:p>
-    <w:p>
-      <w:pPr>
-        <w:rPr>
-          <w:lang w:val="ru-RU"/>
-        </w:rPr>
-      </w:pPr>
     </w:p>
     <w:sectPr>
       <w:pgSz w:w="12240" w:h="15840"/>
@@ -1684,6 +1414,7 @@
   <w:style w:type="character" w:default="1" w:styleId="DefaultParagraphFont">
     <w:name w:val="Default Paragraph Font"/>
     <w:uiPriority w:val="1"/>
+    <w:semiHidden/>
     <w:unhideWhenUsed/>
   </w:style>
   <w:style w:type="table" w:default="1" w:styleId="TableNormal">

</xml_diff>